<commit_message>
update src file from pakeplus
</commit_message>
<xml_diff>
--- a/src/管道强度计算模版.docx
+++ b/src/管道强度计算模版.docx
@@ -4,30 +4,23 @@
   <w:body>
     <w:p>
       <w:pPr>
-        <w:spacing w:line="1550" w:lineRule="exact"/>
-        <w:ind w:firstLine="4084"/>
-      </w:pPr>
-    </w:p>
-    <w:p>
-      <w:pPr>
-        <w:spacing w:line="270" w:lineRule="auto"/>
-      </w:pPr>
-    </w:p>
-    <w:p>
-      <w:pPr>
-        <w:spacing w:line="270" w:lineRule="auto"/>
-      </w:pPr>
-    </w:p>
-    <w:p>
-      <w:pPr>
-        <w:spacing w:line="270" w:lineRule="auto"/>
+        <w:pStyle w:val="a3"/>
+        <w:spacing w:before="211" w:line="187" w:lineRule="auto"/>
+        <w:jc w:val="center"/>
+        <w:rPr>
+          <w:rFonts w:hint="eastAsia"/>
+          <w:spacing w:val="8"/>
+          <w:sz w:val="49"/>
+          <w:szCs w:val="49"/>
+          <w:lang w:eastAsia="zh-CN"/>
+        </w:rPr>
       </w:pPr>
     </w:p>
     <w:p>
       <w:pPr>
         <w:pStyle w:val="a3"/>
         <w:spacing w:before="211" w:line="187" w:lineRule="auto"/>
-        <w:ind w:left="2244"/>
+        <w:jc w:val="center"/>
         <w:rPr>
           <w:rFonts w:hint="eastAsia"/>
           <w:sz w:val="49"/>
@@ -43,7 +36,17 @@
           <w:szCs w:val="49"/>
           <w:lang w:eastAsia="zh-CN"/>
         </w:rPr>
-        <w:t xml:space="preserve">中海油    </w:t>
+        <w:t>XXX</w:t>
+      </w:r>
+      <w:r>
+        <w:rPr>
+          <w:rFonts w:hint="eastAsia"/>
+          <w:spacing w:val="8"/>
+          <w:sz w:val="49"/>
+          <w:szCs w:val="49"/>
+          <w:lang w:eastAsia="zh-CN"/>
+        </w:rPr>
+        <w:t xml:space="preserve">    </w:t>
       </w:r>
       <w:r>
         <w:rPr>
@@ -116,7 +119,7 @@
             <v:path gradientshapeok="t" o:connecttype="rect"/>
           </v:shapetype>
           <v:shape id="_x0000_s1026" type="#_x0000_t202" style="position:absolute;margin-left:-17.35pt;margin-top:11.3pt;width:520.1pt;height:22.1pt;z-index:251659264;mso-width-relative:page;mso-height-relative:page" filled="f" stroked="f">
-            <v:textbox inset="0,0,0,0">
+            <v:textbox style="mso-next-textbox:#_x0000_s1026" inset="0,0,0,0">
               <w:txbxContent>
                 <w:p>
                   <w:pPr>
@@ -127,6 +130,7 @@
                       <w:rFonts w:hint="eastAsia"/>
                       <w:sz w:val="30"/>
                       <w:szCs w:val="30"/>
+                      <w:lang w:eastAsia="zh-CN"/>
                     </w:rPr>
                   </w:pPr>
                   <w:r>
@@ -206,6 +210,7 @@
       <w:pPr>
         <w:spacing w:line="242" w:lineRule="auto"/>
         <w:rPr>
+          <w:rFonts w:eastAsiaTheme="minorEastAsia" w:hint="eastAsia"/>
           <w:lang w:eastAsia="zh-CN"/>
         </w:rPr>
       </w:pPr>
@@ -405,19 +410,56 @@
         <w:ind w:left="3208"/>
         <w:rPr>
           <w:rFonts w:hint="eastAsia"/>
-          <w:sz w:val="38"/>
-          <w:szCs w:val="38"/>
-          <w:lang w:eastAsia="zh-CN"/>
-        </w:rPr>
-      </w:pPr>
-      <w:r>
-        <w:rPr>
           <w:spacing w:val="-5"/>
           <w:sz w:val="38"/>
           <w:szCs w:val="38"/>
           <w:lang w:eastAsia="zh-CN"/>
         </w:rPr>
+      </w:pPr>
+      <w:r>
+        <w:rPr>
+          <w:spacing w:val="-5"/>
+          <w:sz w:val="38"/>
+          <w:szCs w:val="38"/>
+          <w:lang w:eastAsia="zh-CN"/>
+        </w:rPr>
         <w:t>设计：</w:t>
+      </w:r>
+    </w:p>
+    <w:p>
+      <w:pPr>
+        <w:pStyle w:val="a3"/>
+        <w:spacing w:before="163" w:line="186" w:lineRule="auto"/>
+        <w:ind w:left="3208"/>
+        <w:rPr>
+          <w:rFonts w:hint="eastAsia"/>
+          <w:sz w:val="38"/>
+          <w:szCs w:val="38"/>
+          <w:lang w:eastAsia="zh-CN"/>
+        </w:rPr>
+      </w:pPr>
+    </w:p>
+    <w:p>
+      <w:pPr>
+        <w:pStyle w:val="a3"/>
+        <w:spacing w:before="103" w:line="186" w:lineRule="auto"/>
+        <w:ind w:left="3203"/>
+        <w:rPr>
+          <w:rFonts w:hint="eastAsia"/>
+          <w:spacing w:val="-3"/>
+          <w:sz w:val="38"/>
+          <w:szCs w:val="38"/>
+          <w:lang w:eastAsia="zh-CN"/>
+        </w:rPr>
+      </w:pPr>
+      <w:r>
+        <w:rPr>
+          <w:spacing w:val="-3"/>
+          <w:sz w:val="38"/>
+          <w:szCs w:val="38"/>
+          <w:lang w:eastAsia="zh-CN"/>
+        </w:rPr>
+        <w:t>校核：</w:t>
       </w:r>
     </w:p>
     <w:p>
@@ -432,15 +474,6 @@
           <w:lang w:eastAsia="zh-CN"/>
         </w:rPr>
       </w:pPr>
-      <w:r>
-        <w:rPr>
-          <w:spacing w:val="-3"/>
-          <w:sz w:val="38"/>
-          <w:szCs w:val="38"/>
-          <w:lang w:eastAsia="zh-CN"/>
-        </w:rPr>
-        <w:t>校核：</w:t>
-      </w:r>
     </w:p>
     <w:p>
       <w:pPr>
@@ -451,6 +484,7 @@
           <w:rFonts w:hint="eastAsia"/>
           <w:sz w:val="38"/>
           <w:szCs w:val="38"/>
+          <w:lang w:eastAsia="zh-CN"/>
         </w:rPr>
       </w:pPr>
       <w:r>
@@ -458,22 +492,80 @@
           <w:spacing w:val="-9"/>
           <w:sz w:val="38"/>
           <w:szCs w:val="38"/>
+          <w:lang w:eastAsia="zh-CN"/>
         </w:rPr>
         <w:t>审核：</w:t>
       </w:r>
     </w:p>
-    <w:p/>
-    <w:p/>
-    <w:p/>
-    <w:p/>
-    <w:p/>
-    <w:p/>
-    <w:p/>
-    <w:p/>
-    <w:p/>
+    <w:p>
+      <w:pPr>
+        <w:rPr>
+          <w:lang w:eastAsia="zh-CN"/>
+        </w:rPr>
+      </w:pPr>
+    </w:p>
+    <w:p>
+      <w:pPr>
+        <w:rPr>
+          <w:lang w:eastAsia="zh-CN"/>
+        </w:rPr>
+      </w:pPr>
+    </w:p>
+    <w:p>
+      <w:pPr>
+        <w:rPr>
+          <w:lang w:eastAsia="zh-CN"/>
+        </w:rPr>
+      </w:pPr>
+    </w:p>
+    <w:p>
+      <w:pPr>
+        <w:rPr>
+          <w:lang w:eastAsia="zh-CN"/>
+        </w:rPr>
+      </w:pPr>
+    </w:p>
+    <w:p>
+      <w:pPr>
+        <w:rPr>
+          <w:lang w:eastAsia="zh-CN"/>
+        </w:rPr>
+      </w:pPr>
+    </w:p>
+    <w:p>
+      <w:pPr>
+        <w:rPr>
+          <w:lang w:eastAsia="zh-CN"/>
+        </w:rPr>
+      </w:pPr>
+    </w:p>
+    <w:p>
+      <w:pPr>
+        <w:rPr>
+          <w:lang w:eastAsia="zh-CN"/>
+        </w:rPr>
+      </w:pPr>
+    </w:p>
+    <w:p>
+      <w:pPr>
+        <w:rPr>
+          <w:lang w:eastAsia="zh-CN"/>
+        </w:rPr>
+      </w:pPr>
+    </w:p>
+    <w:p>
+      <w:pPr>
+        <w:rPr>
+          <w:lang w:eastAsia="zh-CN"/>
+        </w:rPr>
+      </w:pPr>
+    </w:p>
     <w:p>
       <w:pPr>
         <w:spacing w:line="241" w:lineRule="auto"/>
+        <w:rPr>
+          <w:lang w:eastAsia="zh-CN"/>
+        </w:rPr>
       </w:pPr>
     </w:p>
     <w:p>
@@ -485,6 +577,7 @@
           <w:rFonts w:hint="eastAsia"/>
           <w:sz w:val="42"/>
           <w:szCs w:val="42"/>
+          <w:lang w:eastAsia="zh-CN"/>
         </w:rPr>
       </w:pPr>
       <w:r>
@@ -538,6 +631,7 @@
           <w:spacing w:val="106"/>
           <w:sz w:val="42"/>
           <w:szCs w:val="42"/>
+          <w:lang w:eastAsia="zh-CN"/>
         </w:rPr>
         <w:t xml:space="preserve"> </w:t>
       </w:r>
@@ -549,13 +643,34 @@
           <w:szCs w:val="42"/>
           <w:lang w:eastAsia="zh-CN"/>
         </w:rPr>
-        <w:t xml:space="preserve">                </w:t>
+        <w:t xml:space="preserve">               </w:t>
+      </w:r>
+      <w:r>
+        <w:rPr>
+          <w:rFonts w:hint="eastAsia"/>
+          <w:spacing w:val="106"/>
+          <w:sz w:val="42"/>
+          <w:szCs w:val="42"/>
+          <w:lang w:eastAsia="zh-CN"/>
+        </w:rPr>
+        <w:t>XXX</w:t>
+      </w:r>
+      <w:r>
+        <w:rPr>
+          <w:rFonts w:hint="eastAsia"/>
+          <w:spacing w:val="106"/>
+          <w:sz w:val="42"/>
+          <w:szCs w:val="42"/>
+          <w:lang w:eastAsia="zh-CN"/>
+        </w:rPr>
+        <w:t xml:space="preserve"> </w:t>
       </w:r>
       <w:r>
         <w:rPr>
           <w:spacing w:val="-10"/>
           <w:sz w:val="42"/>
           <w:szCs w:val="42"/>
+          <w:lang w:eastAsia="zh-CN"/>
         </w:rPr>
         <w:t>有  限  公  司</w:t>
       </w:r>
@@ -577,8 +692,63 @@
           <w:spacing w:val="-4"/>
           <w:sz w:val="26"/>
           <w:szCs w:val="26"/>
-        </w:rPr>
-        <w:t xml:space="preserve">                                 2026年02月02日</w:t>
+          <w:lang w:eastAsia="zh-CN"/>
+        </w:rPr>
+        <w:t xml:space="preserve">                                 </w:t>
+      </w:r>
+      <w:r>
+        <w:rPr>
+          <w:rFonts w:hint="eastAsia"/>
+          <w:spacing w:val="-4"/>
+          <w:sz w:val="26"/>
+          <w:szCs w:val="26"/>
+          <w:lang w:eastAsia="zh-CN"/>
+        </w:rPr>
+        <w:t>XXXX</w:t>
+      </w:r>
+      <w:r>
+        <w:rPr>
+          <w:spacing w:val="-4"/>
+          <w:sz w:val="26"/>
+          <w:szCs w:val="26"/>
+        </w:rPr>
+        <w:t>年</w:t>
+      </w:r>
+      <w:r>
+        <w:rPr>
+          <w:rFonts w:hint="eastAsia"/>
+          <w:spacing w:val="-4"/>
+          <w:sz w:val="26"/>
+          <w:szCs w:val="26"/>
+          <w:lang w:eastAsia="zh-CN"/>
+        </w:rPr>
+        <w:t>XX</w:t>
+      </w:r>
+      <w:r>
+        <w:rPr>
+          <w:spacing w:val="-4"/>
+          <w:sz w:val="26"/>
+          <w:szCs w:val="26"/>
+        </w:rPr>
+        <w:t>月</w:t>
+      </w:r>
+      <w:r>
+        <w:rPr>
+          <w:rFonts w:hint="eastAsia"/>
+          <w:spacing w:val="-4"/>
+          <w:sz w:val="26"/>
+          <w:szCs w:val="26"/>
+          <w:lang w:eastAsia="zh-CN"/>
+        </w:rPr>
+        <w:t>XX</w:t>
+      </w:r>
+      <w:r>
+        <w:rPr>
+          <w:spacing w:val="-4"/>
+          <w:sz w:val="26"/>
+          <w:szCs w:val="26"/>
+        </w:rPr>
+        <w:t>日</w:t>
       </w:r>
     </w:p>
     <w:p>
@@ -589,6 +759,12 @@
           <w:szCs w:val="26"/>
         </w:rPr>
         <w:sectPr>
+          <w:headerReference w:type="even" r:id="rId8"/>
+          <w:headerReference w:type="default" r:id="rId9"/>
+          <w:footerReference w:type="even" r:id="rId10"/>
+          <w:footerReference w:type="default" r:id="rId11"/>
+          <w:headerReference w:type="first" r:id="rId12"/>
+          <w:footerReference w:type="first" r:id="rId13"/>
           <w:pgSz w:w="11906" w:h="16838"/>
           <w:pgMar w:top="1075" w:right="740" w:bottom="0" w:left="1233" w:header="0" w:footer="0" w:gutter="0"/>
           <w:cols w:space="720"/>
@@ -1729,7 +1905,7 @@
                           <pic:cNvPicPr/>
                         </pic:nvPicPr>
                         <pic:blipFill>
-                          <a:blip r:embed="rId8"/>
+                          <a:blip r:embed="rId14"/>
                           <a:stretch>
                             <a:fillRect/>
                           </a:stretch>
@@ -3263,7 +3439,7 @@
                           <pic:cNvPicPr/>
                         </pic:nvPicPr>
                         <pic:blipFill>
-                          <a:blip r:embed="rId9"/>
+                          <a:blip r:embed="rId15"/>
                           <a:stretch>
                             <a:fillRect/>
                           </a:stretch>
@@ -3394,7 +3570,7 @@
                           <pic:cNvPicPr/>
                         </pic:nvPicPr>
                         <pic:blipFill>
-                          <a:blip r:embed="rId10"/>
+                          <a:blip r:embed="rId16"/>
                           <a:stretch>
                             <a:fillRect/>
                           </a:stretch>
@@ -3792,7 +3968,7 @@
                           <pic:cNvPicPr/>
                         </pic:nvPicPr>
                         <pic:blipFill>
-                          <a:blip r:embed="rId11"/>
+                          <a:blip r:embed="rId17"/>
                           <a:stretch>
                             <a:fillRect/>
                           </a:stretch>
@@ -4490,33 +4666,14 @@
     <w:p>
       <w:pPr>
         <w:rPr>
-          <w:lang w:eastAsia="zh-CN"/>
-        </w:rPr>
-      </w:pPr>
-    </w:p>
-    <w:p>
-      <w:pPr>
-        <w:rPr>
-          <w:lang w:eastAsia="zh-CN"/>
-        </w:rPr>
-        <w:sectPr>
-          <w:footerReference w:type="default" r:id="rId12"/>
-          <w:pgSz w:w="11906" w:h="16838"/>
-          <w:pgMar w:top="466" w:right="721" w:bottom="689" w:left="1214" w:header="0" w:footer="408" w:gutter="0"/>
-          <w:cols w:space="720"/>
-        </w:sectPr>
-      </w:pPr>
-    </w:p>
-    <w:p>
-      <w:pPr>
-        <w:rPr>
+          <w:rFonts w:eastAsiaTheme="minorEastAsia"/>
           <w:lang w:eastAsia="zh-CN"/>
         </w:rPr>
       </w:pPr>
     </w:p>
     <w:sectPr>
-      <w:headerReference w:type="default" r:id="rId13"/>
-      <w:footerReference w:type="default" r:id="rId14"/>
+      <w:headerReference w:type="default" r:id="rId18"/>
+      <w:footerReference w:type="default" r:id="rId19"/>
       <w:pgSz w:w="11906" w:h="16838"/>
       <w:pgMar w:top="779" w:right="721" w:bottom="689" w:left="1214" w:header="454" w:footer="408" w:gutter="0"/>
       <w:cols w:space="720"/>
@@ -4548,53 +4705,8 @@
 <w:ftr xmlns:wpc="http://schemas.microsoft.com/office/word/2010/wordprocessingCanvas" xmlns:cx="http://schemas.microsoft.com/office/drawing/2014/chartex" xmlns:cx1="http://schemas.microsoft.com/office/drawing/2015/9/8/chartex" xmlns:cx2="http://schemas.microsoft.com/office/drawing/2015/10/21/chartex" xmlns:cx3="http://schemas.microsoft.com/office/drawing/2016/5/9/chartex" xmlns:cx4="http://schemas.microsoft.com/office/drawing/2016/5/10/chartex" xmlns:cx5="http://schemas.microsoft.com/office/drawing/2016/5/11/chartex" xmlns:cx6="http://schemas.microsoft.com/office/drawing/2016/5/12/chartex" xmlns:cx7="http://schemas.microsoft.com/office/drawing/2016/5/13/chartex" xmlns:cx8="http://schemas.microsoft.com/office/drawing/2016/5/14/chartex" xmlns:mc="http://schemas.openxmlformats.org/markup-compatibility/2006" xmlns:aink="http://schemas.microsoft.com/office/drawing/2016/ink" xmlns:am3d="http://schemas.microsoft.com/office/drawing/2017/model3d" xmlns:o="urn:schemas-microsoft-com:office:office" xmlns:oel="http://schemas.microsoft.com/office/2019/extlst" xmlns:r="http://schemas.openxmlformats.org/officeDocument/2006/relationships" xmlns:m="http://schemas.openxmlformats.org/officeDocument/2006/math" xmlns:v="urn:schemas-microsoft-com:vml" xmlns:wp14="http://schemas.microsoft.com/office/word/2010/wordprocessingDrawing" xmlns:wp="http://schemas.openxmlformats.org/drawingml/2006/wordprocessingDrawing" xmlns:w10="urn:schemas-microsoft-com:office:word" xmlns:w="http://schemas.openxmlformats.org/wordprocessingml/2006/main" xmlns:w14="http://schemas.microsoft.com/office/word/2010/wordml" xmlns:w15="http://schemas.microsoft.com/office/word/2012/wordml" xmlns:w16cex="http://schemas.microsoft.com/office/word/2018/wordml/cex" xmlns:w16cid="http://schemas.microsoft.com/office/word/2016/wordml/cid" xmlns:w16="http://schemas.microsoft.com/office/word/2018/wordml" xmlns:w16du="http://schemas.microsoft.com/office/word/2023/wordml/word16du" xmlns:w16sdtdh="http://schemas.microsoft.com/office/word/2020/wordml/sdtdatahash" xmlns:w16sdtfl="http://schemas.microsoft.com/office/word/2024/wordml/sdtformatlock" xmlns:w16se="http://schemas.microsoft.com/office/word/2015/wordml/symex" xmlns:wpg="http://schemas.microsoft.com/office/word/2010/wordprocessingGroup" xmlns:wpi="http://schemas.microsoft.com/office/word/2010/wordprocessingInk" xmlns:wne="http://schemas.microsoft.com/office/word/2006/wordml" xmlns:wps="http://schemas.microsoft.com/office/word/2010/wordprocessingShape" mc:Ignorable="w14 w15 w16se w16cid w16 w16cex w16sdtdh w16sdtfl w16du wp14">
   <w:p>
     <w:pPr>
-      <w:pStyle w:val="a3"/>
-      <w:spacing w:before="1" w:line="180" w:lineRule="auto"/>
-      <w:ind w:left="4366"/>
-      <w:rPr>
-        <w:rFonts w:hint="eastAsia"/>
-        <w:sz w:val="21"/>
-        <w:szCs w:val="21"/>
-      </w:rPr>
+      <w:pStyle w:val="a6"/>
     </w:pPr>
-    <w:r>
-      <w:rPr>
-        <w:spacing w:val="-15"/>
-        <w:sz w:val="21"/>
-        <w:szCs w:val="21"/>
-      </w:rPr>
-      <w:t>第</w:t>
-    </w:r>
-    <w:r>
-      <w:rPr>
-        <w:sz w:val="21"/>
-        <w:szCs w:val="21"/>
-      </w:rPr>
-      <w:t xml:space="preserve">  </w:t>
-    </w:r>
-    <w:r>
-      <w:rPr>
-        <w:spacing w:val="-15"/>
-        <w:sz w:val="21"/>
-        <w:szCs w:val="21"/>
-      </w:rPr>
-      <w:t>1</w:t>
-    </w:r>
-    <w:r>
-      <w:rPr>
-        <w:sz w:val="21"/>
-        <w:szCs w:val="21"/>
-      </w:rPr>
-      <w:t xml:space="preserve">  </w:t>
-    </w:r>
-    <w:r>
-      <w:rPr>
-        <w:spacing w:val="-15"/>
-        <w:sz w:val="21"/>
-        <w:szCs w:val="21"/>
-      </w:rPr>
-      <w:t>页</w:t>
-    </w:r>
   </w:p>
 </w:ftr>
 </file>
@@ -4603,55 +4715,35 @@
 <w:ftr xmlns:wpc="http://schemas.microsoft.com/office/word/2010/wordprocessingCanvas" xmlns:cx="http://schemas.microsoft.com/office/drawing/2014/chartex" xmlns:cx1="http://schemas.microsoft.com/office/drawing/2015/9/8/chartex" xmlns:cx2="http://schemas.microsoft.com/office/drawing/2015/10/21/chartex" xmlns:cx3="http://schemas.microsoft.com/office/drawing/2016/5/9/chartex" xmlns:cx4="http://schemas.microsoft.com/office/drawing/2016/5/10/chartex" xmlns:cx5="http://schemas.microsoft.com/office/drawing/2016/5/11/chartex" xmlns:cx6="http://schemas.microsoft.com/office/drawing/2016/5/12/chartex" xmlns:cx7="http://schemas.microsoft.com/office/drawing/2016/5/13/chartex" xmlns:cx8="http://schemas.microsoft.com/office/drawing/2016/5/14/chartex" xmlns:mc="http://schemas.openxmlformats.org/markup-compatibility/2006" xmlns:aink="http://schemas.microsoft.com/office/drawing/2016/ink" xmlns:am3d="http://schemas.microsoft.com/office/drawing/2017/model3d" xmlns:o="urn:schemas-microsoft-com:office:office" xmlns:oel="http://schemas.microsoft.com/office/2019/extlst" xmlns:r="http://schemas.openxmlformats.org/officeDocument/2006/relationships" xmlns:m="http://schemas.openxmlformats.org/officeDocument/2006/math" xmlns:v="urn:schemas-microsoft-com:vml" xmlns:wp14="http://schemas.microsoft.com/office/word/2010/wordprocessingDrawing" xmlns:wp="http://schemas.openxmlformats.org/drawingml/2006/wordprocessingDrawing" xmlns:w10="urn:schemas-microsoft-com:office:word" xmlns:w="http://schemas.openxmlformats.org/wordprocessingml/2006/main" xmlns:w14="http://schemas.microsoft.com/office/word/2010/wordml" xmlns:w15="http://schemas.microsoft.com/office/word/2012/wordml" xmlns:w16cex="http://schemas.microsoft.com/office/word/2018/wordml/cex" xmlns:w16cid="http://schemas.microsoft.com/office/word/2016/wordml/cid" xmlns:w16="http://schemas.microsoft.com/office/word/2018/wordml" xmlns:w16du="http://schemas.microsoft.com/office/word/2023/wordml/word16du" xmlns:w16sdtdh="http://schemas.microsoft.com/office/word/2020/wordml/sdtdatahash" xmlns:w16sdtfl="http://schemas.microsoft.com/office/word/2024/wordml/sdtformatlock" xmlns:w16se="http://schemas.microsoft.com/office/word/2015/wordml/symex" xmlns:wpg="http://schemas.microsoft.com/office/word/2010/wordprocessingGroup" xmlns:wpi="http://schemas.microsoft.com/office/word/2010/wordprocessingInk" xmlns:wne="http://schemas.microsoft.com/office/word/2006/wordml" xmlns:wps="http://schemas.microsoft.com/office/word/2010/wordprocessingShape" mc:Ignorable="w14 w15 w16se w16cid w16 w16cex w16sdtdh w16sdtfl w16du wp14">
   <w:p>
     <w:pPr>
+      <w:pStyle w:val="a6"/>
+    </w:pPr>
+  </w:p>
+</w:ftr>
+</file>
+
+<file path=word/footer3.xml><?xml version="1.0" encoding="utf-8"?>
+<w:ftr xmlns:wpc="http://schemas.microsoft.com/office/word/2010/wordprocessingCanvas" xmlns:cx="http://schemas.microsoft.com/office/drawing/2014/chartex" xmlns:cx1="http://schemas.microsoft.com/office/drawing/2015/9/8/chartex" xmlns:cx2="http://schemas.microsoft.com/office/drawing/2015/10/21/chartex" xmlns:cx3="http://schemas.microsoft.com/office/drawing/2016/5/9/chartex" xmlns:cx4="http://schemas.microsoft.com/office/drawing/2016/5/10/chartex" xmlns:cx5="http://schemas.microsoft.com/office/drawing/2016/5/11/chartex" xmlns:cx6="http://schemas.microsoft.com/office/drawing/2016/5/12/chartex" xmlns:cx7="http://schemas.microsoft.com/office/drawing/2016/5/13/chartex" xmlns:cx8="http://schemas.microsoft.com/office/drawing/2016/5/14/chartex" xmlns:mc="http://schemas.openxmlformats.org/markup-compatibility/2006" xmlns:aink="http://schemas.microsoft.com/office/drawing/2016/ink" xmlns:am3d="http://schemas.microsoft.com/office/drawing/2017/model3d" xmlns:o="urn:schemas-microsoft-com:office:office" xmlns:oel="http://schemas.microsoft.com/office/2019/extlst" xmlns:r="http://schemas.openxmlformats.org/officeDocument/2006/relationships" xmlns:m="http://schemas.openxmlformats.org/officeDocument/2006/math" xmlns:v="urn:schemas-microsoft-com:vml" xmlns:wp14="http://schemas.microsoft.com/office/word/2010/wordprocessingDrawing" xmlns:wp="http://schemas.openxmlformats.org/drawingml/2006/wordprocessingDrawing" xmlns:w10="urn:schemas-microsoft-com:office:word" xmlns:w="http://schemas.openxmlformats.org/wordprocessingml/2006/main" xmlns:w14="http://schemas.microsoft.com/office/word/2010/wordml" xmlns:w15="http://schemas.microsoft.com/office/word/2012/wordml" xmlns:w16cex="http://schemas.microsoft.com/office/word/2018/wordml/cex" xmlns:w16cid="http://schemas.microsoft.com/office/word/2016/wordml/cid" xmlns:w16="http://schemas.microsoft.com/office/word/2018/wordml" xmlns:w16du="http://schemas.microsoft.com/office/word/2023/wordml/word16du" xmlns:w16sdtdh="http://schemas.microsoft.com/office/word/2020/wordml/sdtdatahash" xmlns:w16sdtfl="http://schemas.microsoft.com/office/word/2024/wordml/sdtformatlock" xmlns:w16se="http://schemas.microsoft.com/office/word/2015/wordml/symex" xmlns:wpg="http://schemas.microsoft.com/office/word/2010/wordprocessingGroup" xmlns:wpi="http://schemas.microsoft.com/office/word/2010/wordprocessingInk" xmlns:wne="http://schemas.microsoft.com/office/word/2006/wordml" xmlns:wps="http://schemas.microsoft.com/office/word/2010/wordprocessingShape" mc:Ignorable="w14 w15 w16se w16cid w16 w16cex w16sdtdh w16sdtfl w16du wp14">
+  <w:p>
+    <w:pPr>
+      <w:pStyle w:val="a6"/>
+    </w:pPr>
+  </w:p>
+</w:ftr>
+</file>
+
+<file path=word/footer4.xml><?xml version="1.0" encoding="utf-8"?>
+<w:ftr xmlns:wpc="http://schemas.microsoft.com/office/word/2010/wordprocessingCanvas" xmlns:cx="http://schemas.microsoft.com/office/drawing/2014/chartex" xmlns:cx1="http://schemas.microsoft.com/office/drawing/2015/9/8/chartex" xmlns:cx2="http://schemas.microsoft.com/office/drawing/2015/10/21/chartex" xmlns:cx3="http://schemas.microsoft.com/office/drawing/2016/5/9/chartex" xmlns:cx4="http://schemas.microsoft.com/office/drawing/2016/5/10/chartex" xmlns:cx5="http://schemas.microsoft.com/office/drawing/2016/5/11/chartex" xmlns:cx6="http://schemas.microsoft.com/office/drawing/2016/5/12/chartex" xmlns:cx7="http://schemas.microsoft.com/office/drawing/2016/5/13/chartex" xmlns:cx8="http://schemas.microsoft.com/office/drawing/2016/5/14/chartex" xmlns:mc="http://schemas.openxmlformats.org/markup-compatibility/2006" xmlns:aink="http://schemas.microsoft.com/office/drawing/2016/ink" xmlns:am3d="http://schemas.microsoft.com/office/drawing/2017/model3d" xmlns:o="urn:schemas-microsoft-com:office:office" xmlns:oel="http://schemas.microsoft.com/office/2019/extlst" xmlns:r="http://schemas.openxmlformats.org/officeDocument/2006/relationships" xmlns:m="http://schemas.openxmlformats.org/officeDocument/2006/math" xmlns:v="urn:schemas-microsoft-com:vml" xmlns:wp14="http://schemas.microsoft.com/office/word/2010/wordprocessingDrawing" xmlns:wp="http://schemas.openxmlformats.org/drawingml/2006/wordprocessingDrawing" xmlns:w10="urn:schemas-microsoft-com:office:word" xmlns:w="http://schemas.openxmlformats.org/wordprocessingml/2006/main" xmlns:w14="http://schemas.microsoft.com/office/word/2010/wordml" xmlns:w15="http://schemas.microsoft.com/office/word/2012/wordml" xmlns:w16cex="http://schemas.microsoft.com/office/word/2018/wordml/cex" xmlns:w16cid="http://schemas.microsoft.com/office/word/2016/wordml/cid" xmlns:w16="http://schemas.microsoft.com/office/word/2018/wordml" xmlns:w16du="http://schemas.microsoft.com/office/word/2023/wordml/word16du" xmlns:w16sdtdh="http://schemas.microsoft.com/office/word/2020/wordml/sdtdatahash" xmlns:w16sdtfl="http://schemas.microsoft.com/office/word/2024/wordml/sdtformatlock" xmlns:w16se="http://schemas.microsoft.com/office/word/2015/wordml/symex" xmlns:wpg="http://schemas.microsoft.com/office/word/2010/wordprocessingGroup" xmlns:wpi="http://schemas.microsoft.com/office/word/2010/wordprocessingInk" xmlns:wne="http://schemas.microsoft.com/office/word/2006/wordml" xmlns:wps="http://schemas.microsoft.com/office/word/2010/wordprocessingShape" mc:Ignorable="w14 w15 w16se w16cid w16 w16cex w16sdtdh w16sdtfl w16du wp14">
+  <w:p>
+    <w:pPr>
       <w:pStyle w:val="a3"/>
       <w:spacing w:before="1" w:line="180" w:lineRule="auto"/>
-      <w:ind w:left="4366"/>
       <w:rPr>
         <w:rFonts w:hint="eastAsia"/>
         <w:sz w:val="21"/>
         <w:szCs w:val="21"/>
+        <w:lang w:eastAsia="zh-CN"/>
       </w:rPr>
     </w:pPr>
-    <w:r>
-      <w:rPr>
-        <w:spacing w:val="-11"/>
-        <w:sz w:val="21"/>
-        <w:szCs w:val="21"/>
-      </w:rPr>
-      <w:t>第</w:t>
-    </w:r>
-    <w:r>
-      <w:rPr>
-        <w:spacing w:val="50"/>
-        <w:w w:val="101"/>
-        <w:sz w:val="21"/>
-        <w:szCs w:val="21"/>
-      </w:rPr>
-      <w:t xml:space="preserve"> </w:t>
-    </w:r>
-    <w:r>
-      <w:rPr>
-        <w:spacing w:val="-11"/>
-        <w:sz w:val="21"/>
-        <w:szCs w:val="21"/>
-      </w:rPr>
-      <w:t>2</w:t>
-    </w:r>
-    <w:r>
-      <w:rPr>
-        <w:sz w:val="21"/>
-        <w:szCs w:val="21"/>
-      </w:rPr>
-      <w:t xml:space="preserve">  </w:t>
-    </w:r>
-    <w:r>
-      <w:rPr>
-        <w:spacing w:val="-11"/>
-        <w:sz w:val="21"/>
-        <w:szCs w:val="21"/>
-      </w:rPr>
-      <w:t>页</w:t>
-    </w:r>
   </w:p>
 </w:ftr>
 </file>
@@ -4679,34 +4771,43 @@
 <w:hdr xmlns:wpc="http://schemas.microsoft.com/office/word/2010/wordprocessingCanvas" xmlns:cx="http://schemas.microsoft.com/office/drawing/2014/chartex" xmlns:cx1="http://schemas.microsoft.com/office/drawing/2015/9/8/chartex" xmlns:cx2="http://schemas.microsoft.com/office/drawing/2015/10/21/chartex" xmlns:cx3="http://schemas.microsoft.com/office/drawing/2016/5/9/chartex" xmlns:cx4="http://schemas.microsoft.com/office/drawing/2016/5/10/chartex" xmlns:cx5="http://schemas.microsoft.com/office/drawing/2016/5/11/chartex" xmlns:cx6="http://schemas.microsoft.com/office/drawing/2016/5/12/chartex" xmlns:cx7="http://schemas.microsoft.com/office/drawing/2016/5/13/chartex" xmlns:cx8="http://schemas.microsoft.com/office/drawing/2016/5/14/chartex" xmlns:mc="http://schemas.openxmlformats.org/markup-compatibility/2006" xmlns:aink="http://schemas.microsoft.com/office/drawing/2016/ink" xmlns:am3d="http://schemas.microsoft.com/office/drawing/2017/model3d" xmlns:o="urn:schemas-microsoft-com:office:office" xmlns:oel="http://schemas.microsoft.com/office/2019/extlst" xmlns:r="http://schemas.openxmlformats.org/officeDocument/2006/relationships" xmlns:m="http://schemas.openxmlformats.org/officeDocument/2006/math" xmlns:v="urn:schemas-microsoft-com:vml" xmlns:wp14="http://schemas.microsoft.com/office/word/2010/wordprocessingDrawing" xmlns:wp="http://schemas.openxmlformats.org/drawingml/2006/wordprocessingDrawing" xmlns:w10="urn:schemas-microsoft-com:office:word" xmlns:w="http://schemas.openxmlformats.org/wordprocessingml/2006/main" xmlns:w14="http://schemas.microsoft.com/office/word/2010/wordml" xmlns:w15="http://schemas.microsoft.com/office/word/2012/wordml" xmlns:w16cex="http://schemas.microsoft.com/office/word/2018/wordml/cex" xmlns:w16cid="http://schemas.microsoft.com/office/word/2016/wordml/cid" xmlns:w16="http://schemas.microsoft.com/office/word/2018/wordml" xmlns:w16du="http://schemas.microsoft.com/office/word/2023/wordml/word16du" xmlns:w16sdtdh="http://schemas.microsoft.com/office/word/2020/wordml/sdtdatahash" xmlns:w16sdtfl="http://schemas.microsoft.com/office/word/2024/wordml/sdtformatlock" xmlns:w16se="http://schemas.microsoft.com/office/word/2015/wordml/symex" xmlns:wpg="http://schemas.microsoft.com/office/word/2010/wordprocessingGroup" xmlns:wpi="http://schemas.microsoft.com/office/word/2010/wordprocessingInk" xmlns:wne="http://schemas.microsoft.com/office/word/2006/wordml" xmlns:wps="http://schemas.microsoft.com/office/word/2010/wordprocessingShape" mc:Ignorable="w14 w15 w16se w16cid w16 w16cex w16sdtdh w16sdtfl w16du wp14">
   <w:p>
     <w:pPr>
-      <w:pStyle w:val="a3"/>
-      <w:spacing w:before="55" w:line="173" w:lineRule="auto"/>
-      <w:ind w:left="124"/>
+      <w:pStyle w:val="a4"/>
+    </w:pPr>
+  </w:p>
+</w:hdr>
+</file>
+
+<file path=word/header2.xml><?xml version="1.0" encoding="utf-8"?>
+<w:hdr xmlns:wpc="http://schemas.microsoft.com/office/word/2010/wordprocessingCanvas" xmlns:cx="http://schemas.microsoft.com/office/drawing/2014/chartex" xmlns:cx1="http://schemas.microsoft.com/office/drawing/2015/9/8/chartex" xmlns:cx2="http://schemas.microsoft.com/office/drawing/2015/10/21/chartex" xmlns:cx3="http://schemas.microsoft.com/office/drawing/2016/5/9/chartex" xmlns:cx4="http://schemas.microsoft.com/office/drawing/2016/5/10/chartex" xmlns:cx5="http://schemas.microsoft.com/office/drawing/2016/5/11/chartex" xmlns:cx6="http://schemas.microsoft.com/office/drawing/2016/5/12/chartex" xmlns:cx7="http://schemas.microsoft.com/office/drawing/2016/5/13/chartex" xmlns:cx8="http://schemas.microsoft.com/office/drawing/2016/5/14/chartex" xmlns:mc="http://schemas.openxmlformats.org/markup-compatibility/2006" xmlns:aink="http://schemas.microsoft.com/office/drawing/2016/ink" xmlns:am3d="http://schemas.microsoft.com/office/drawing/2017/model3d" xmlns:o="urn:schemas-microsoft-com:office:office" xmlns:oel="http://schemas.microsoft.com/office/2019/extlst" xmlns:r="http://schemas.openxmlformats.org/officeDocument/2006/relationships" xmlns:m="http://schemas.openxmlformats.org/officeDocument/2006/math" xmlns:v="urn:schemas-microsoft-com:vml" xmlns:wp14="http://schemas.microsoft.com/office/word/2010/wordprocessingDrawing" xmlns:wp="http://schemas.openxmlformats.org/drawingml/2006/wordprocessingDrawing" xmlns:w10="urn:schemas-microsoft-com:office:word" xmlns:w="http://schemas.openxmlformats.org/wordprocessingml/2006/main" xmlns:w14="http://schemas.microsoft.com/office/word/2010/wordml" xmlns:w15="http://schemas.microsoft.com/office/word/2012/wordml" xmlns:w16cex="http://schemas.microsoft.com/office/word/2018/wordml/cex" xmlns:w16cid="http://schemas.microsoft.com/office/word/2016/wordml/cid" xmlns:w16="http://schemas.microsoft.com/office/word/2018/wordml" xmlns:w16du="http://schemas.microsoft.com/office/word/2023/wordml/word16du" xmlns:w16sdtdh="http://schemas.microsoft.com/office/word/2020/wordml/sdtdatahash" xmlns:w16sdtfl="http://schemas.microsoft.com/office/word/2024/wordml/sdtformatlock" xmlns:w16se="http://schemas.microsoft.com/office/word/2015/wordml/symex" xmlns:wpg="http://schemas.microsoft.com/office/word/2010/wordprocessingGroup" xmlns:wpi="http://schemas.microsoft.com/office/word/2010/wordprocessingInk" xmlns:wne="http://schemas.microsoft.com/office/word/2006/wordml" xmlns:wps="http://schemas.microsoft.com/office/word/2010/wordprocessingShape" mc:Ignorable="w14 w15 w16se w16cid w16 w16cex w16sdtdh w16sdtfl w16du wp14">
+  <w:p>
+    <w:pPr>
+      <w:pStyle w:val="a4"/>
+    </w:pPr>
+  </w:p>
+</w:hdr>
+</file>
+
+<file path=word/header3.xml><?xml version="1.0" encoding="utf-8"?>
+<w:hdr xmlns:wpc="http://schemas.microsoft.com/office/word/2010/wordprocessingCanvas" xmlns:cx="http://schemas.microsoft.com/office/drawing/2014/chartex" xmlns:cx1="http://schemas.microsoft.com/office/drawing/2015/9/8/chartex" xmlns:cx2="http://schemas.microsoft.com/office/drawing/2015/10/21/chartex" xmlns:cx3="http://schemas.microsoft.com/office/drawing/2016/5/9/chartex" xmlns:cx4="http://schemas.microsoft.com/office/drawing/2016/5/10/chartex" xmlns:cx5="http://schemas.microsoft.com/office/drawing/2016/5/11/chartex" xmlns:cx6="http://schemas.microsoft.com/office/drawing/2016/5/12/chartex" xmlns:cx7="http://schemas.microsoft.com/office/drawing/2016/5/13/chartex" xmlns:cx8="http://schemas.microsoft.com/office/drawing/2016/5/14/chartex" xmlns:mc="http://schemas.openxmlformats.org/markup-compatibility/2006" xmlns:aink="http://schemas.microsoft.com/office/drawing/2016/ink" xmlns:am3d="http://schemas.microsoft.com/office/drawing/2017/model3d" xmlns:o="urn:schemas-microsoft-com:office:office" xmlns:oel="http://schemas.microsoft.com/office/2019/extlst" xmlns:r="http://schemas.openxmlformats.org/officeDocument/2006/relationships" xmlns:m="http://schemas.openxmlformats.org/officeDocument/2006/math" xmlns:v="urn:schemas-microsoft-com:vml" xmlns:wp14="http://schemas.microsoft.com/office/word/2010/wordprocessingDrawing" xmlns:wp="http://schemas.openxmlformats.org/drawingml/2006/wordprocessingDrawing" xmlns:w10="urn:schemas-microsoft-com:office:word" xmlns:w="http://schemas.openxmlformats.org/wordprocessingml/2006/main" xmlns:w14="http://schemas.microsoft.com/office/word/2010/wordml" xmlns:w15="http://schemas.microsoft.com/office/word/2012/wordml" xmlns:w16cex="http://schemas.microsoft.com/office/word/2018/wordml/cex" xmlns:w16cid="http://schemas.microsoft.com/office/word/2016/wordml/cid" xmlns:w16="http://schemas.microsoft.com/office/word/2018/wordml" xmlns:w16du="http://schemas.microsoft.com/office/word/2023/wordml/word16du" xmlns:w16sdtdh="http://schemas.microsoft.com/office/word/2020/wordml/sdtdatahash" xmlns:w16sdtfl="http://schemas.microsoft.com/office/word/2024/wordml/sdtformatlock" xmlns:w16se="http://schemas.microsoft.com/office/word/2015/wordml/symex" xmlns:wpg="http://schemas.microsoft.com/office/word/2010/wordprocessingGroup" xmlns:wpi="http://schemas.microsoft.com/office/word/2010/wordprocessingInk" xmlns:wne="http://schemas.microsoft.com/office/word/2006/wordml" xmlns:wps="http://schemas.microsoft.com/office/word/2010/wordprocessingShape" mc:Ignorable="w14 w15 w16se w16cid w16 w16cex w16sdtdh w16sdtfl w16du wp14">
+  <w:p>
+    <w:pPr>
+      <w:pStyle w:val="a4"/>
+    </w:pPr>
+  </w:p>
+</w:hdr>
+</file>
+
+<file path=word/header4.xml><?xml version="1.0" encoding="utf-8"?>
+<w:hdr xmlns:wpc="http://schemas.microsoft.com/office/word/2010/wordprocessingCanvas" xmlns:cx="http://schemas.microsoft.com/office/drawing/2014/chartex" xmlns:cx1="http://schemas.microsoft.com/office/drawing/2015/9/8/chartex" xmlns:cx2="http://schemas.microsoft.com/office/drawing/2015/10/21/chartex" xmlns:cx3="http://schemas.microsoft.com/office/drawing/2016/5/9/chartex" xmlns:cx4="http://schemas.microsoft.com/office/drawing/2016/5/10/chartex" xmlns:cx5="http://schemas.microsoft.com/office/drawing/2016/5/11/chartex" xmlns:cx6="http://schemas.microsoft.com/office/drawing/2016/5/12/chartex" xmlns:cx7="http://schemas.microsoft.com/office/drawing/2016/5/13/chartex" xmlns:cx8="http://schemas.microsoft.com/office/drawing/2016/5/14/chartex" xmlns:mc="http://schemas.openxmlformats.org/markup-compatibility/2006" xmlns:aink="http://schemas.microsoft.com/office/drawing/2016/ink" xmlns:am3d="http://schemas.microsoft.com/office/drawing/2017/model3d" xmlns:o="urn:schemas-microsoft-com:office:office" xmlns:oel="http://schemas.microsoft.com/office/2019/extlst" xmlns:r="http://schemas.openxmlformats.org/officeDocument/2006/relationships" xmlns:m="http://schemas.openxmlformats.org/officeDocument/2006/math" xmlns:v="urn:schemas-microsoft-com:vml" xmlns:wp14="http://schemas.microsoft.com/office/word/2010/wordprocessingDrawing" xmlns:wp="http://schemas.openxmlformats.org/drawingml/2006/wordprocessingDrawing" xmlns:w10="urn:schemas-microsoft-com:office:word" xmlns:w="http://schemas.openxmlformats.org/wordprocessingml/2006/main" xmlns:w14="http://schemas.microsoft.com/office/word/2010/wordml" xmlns:w15="http://schemas.microsoft.com/office/word/2012/wordml" xmlns:w16cex="http://schemas.microsoft.com/office/word/2018/wordml/cex" xmlns:w16cid="http://schemas.microsoft.com/office/word/2016/wordml/cid" xmlns:w16="http://schemas.microsoft.com/office/word/2018/wordml" xmlns:w16du="http://schemas.microsoft.com/office/word/2023/wordml/word16du" xmlns:w16sdtdh="http://schemas.microsoft.com/office/word/2020/wordml/sdtdatahash" xmlns:w16sdtfl="http://schemas.microsoft.com/office/word/2024/wordml/sdtformatlock" xmlns:w16se="http://schemas.microsoft.com/office/word/2015/wordml/symex" xmlns:wpg="http://schemas.microsoft.com/office/word/2010/wordprocessingGroup" xmlns:wpi="http://schemas.microsoft.com/office/word/2010/wordprocessingInk" xmlns:wne="http://schemas.microsoft.com/office/word/2006/wordml" xmlns:wps="http://schemas.microsoft.com/office/word/2010/wordprocessingShape" mc:Ignorable="w14 w15 w16se w16cid w16 w16cex w16sdtdh w16sdtfl w16du wp14">
+  <w:p>
+    <w:pPr>
+      <w:pStyle w:val="a4"/>
+      <w:jc w:val="left"/>
       <w:rPr>
-        <w:rFonts w:hint="eastAsia"/>
-        <w:sz w:val="21"/>
-        <w:szCs w:val="21"/>
+        <w:rFonts w:eastAsiaTheme="minorEastAsia"/>
         <w:lang w:eastAsia="zh-CN"/>
       </w:rPr>
     </w:pPr>
-    <w:r>
-      <w:rPr>
-        <w:spacing w:val="-2"/>
-        <w:sz w:val="21"/>
-        <w:szCs w:val="21"/>
-        <w:lang w:eastAsia="zh-CN"/>
-      </w:rPr>
-      <w:t xml:space="preserve">郎溪天华化工工程设计有限公司                                               </w:t>
-    </w:r>
-    <w:r>
-      <w:rPr>
-        <w:spacing w:val="-3"/>
-        <w:sz w:val="21"/>
-        <w:szCs w:val="21"/>
-        <w:lang w:eastAsia="zh-CN"/>
-      </w:rPr>
-      <w:t xml:space="preserve">       设计资格证书号：TS1834023-2028</w:t>
-    </w:r>
   </w:p>
 </w:hdr>
 </file>
@@ -5093,6 +5194,67 @@
       <w:rFonts w:ascii="微软雅黑" w:eastAsia="微软雅黑" w:hAnsi="微软雅黑" w:cs="微软雅黑"/>
     </w:rPr>
   </w:style>
+  <w:style w:type="paragraph" w:styleId="a4">
+    <w:name w:val="header"/>
+    <w:basedOn w:val="a"/>
+    <w:link w:val="a5"/>
+    <w:rsid w:val="00C84484"/>
+    <w:pPr>
+      <w:tabs>
+        <w:tab w:val="center" w:pos="4153"/>
+        <w:tab w:val="right" w:pos="8306"/>
+      </w:tabs>
+      <w:jc w:val="center"/>
+    </w:pPr>
+    <w:rPr>
+      <w:sz w:val="18"/>
+      <w:szCs w:val="18"/>
+    </w:rPr>
+  </w:style>
+  <w:style w:type="character" w:customStyle="1" w:styleId="a5">
+    <w:name w:val="页眉 字符"/>
+    <w:basedOn w:val="a0"/>
+    <w:link w:val="a4"/>
+    <w:rsid w:val="00C84484"/>
+    <w:rPr>
+      <w:rFonts w:eastAsia="Arial"/>
+      <w:snapToGrid w:val="0"/>
+      <w:color w:val="000000"/>
+      <w:sz w:val="18"/>
+      <w:szCs w:val="18"/>
+      <w:lang w:eastAsia="en-US"/>
+    </w:rPr>
+  </w:style>
+  <w:style w:type="paragraph" w:styleId="a6">
+    <w:name w:val="footer"/>
+    <w:basedOn w:val="a"/>
+    <w:link w:val="a7"/>
+    <w:rsid w:val="00C84484"/>
+    <w:pPr>
+      <w:tabs>
+        <w:tab w:val="center" w:pos="4153"/>
+        <w:tab w:val="right" w:pos="8306"/>
+      </w:tabs>
+    </w:pPr>
+    <w:rPr>
+      <w:sz w:val="18"/>
+      <w:szCs w:val="18"/>
+    </w:rPr>
+  </w:style>
+  <w:style w:type="character" w:customStyle="1" w:styleId="a7">
+    <w:name w:val="页脚 字符"/>
+    <w:basedOn w:val="a0"/>
+    <w:link w:val="a6"/>
+    <w:rsid w:val="00C84484"/>
+    <w:rPr>
+      <w:rFonts w:eastAsia="Arial"/>
+      <w:snapToGrid w:val="0"/>
+      <w:color w:val="000000"/>
+      <w:sz w:val="18"/>
+      <w:szCs w:val="18"/>
+      <w:lang w:eastAsia="en-US"/>
+    </w:rPr>
+  </w:style>
 </w:styles>
 </file>
 

</xml_diff>